<commit_message>
security: fix auth on appointment routes, protect init-db, remove debug files, hide credentials from README
</commit_message>
<xml_diff>
--- a/HMS_Project_Report.docx
+++ b/HMS_Project_Report.docx
@@ -1,51 +1,5 @@
 
-<file path=docProps\app.xml><?xml version="1.0" encoding="utf-8"?>
-<Properties xmlns="http://schemas.openxmlformats.org/officeDocument/2006/extended-properties" xmlns:vt="http://schemas.openxmlformats.org/officeDocument/2006/docPropsVTypes">
-  <Template>Normal.dotm</Template>
-  <TotalTime>23</TotalTime>
-  <Pages>9</Pages>
-  <Words>652</Words>
-  <Characters>3719</Characters>
-  <Application>Microsoft Office Word</Application>
-  <DocSecurity>0</DocSecurity>
-  <Lines>30</Lines>
-  <Paragraphs>8</Paragraphs>
-  <ScaleCrop>false</ScaleCrop>
-  <HeadingPairs>
-    <vt:vector size="2" baseType="variant">
-      <vt:variant>
-        <vt:lpstr>Title</vt:lpstr>
-      </vt:variant>
-      <vt:variant>
-        <vt:i4>1</vt:i4>
-      </vt:variant>
-    </vt:vector>
-  </HeadingPairs>
-  <TitlesOfParts>
-    <vt:vector size="1" baseType="lpstr">
-      <vt:lpstr/>
-    </vt:vector>
-  </TitlesOfParts>
-  <Company/>
-  <LinksUpToDate>false</LinksUpToDate>
-  <CharactersWithSpaces>4363</CharactersWithSpaces>
-  <SharedDoc>false</SharedDoc>
-  <HyperlinksChanged>false</HyperlinksChanged>
-  <AppVersion>16.0000</AppVersion>
-</Properties>
-</file>
-
-<file path=docProps\core.xml><?xml version="1.0" encoding="utf-8"?>
-<cp:coreProperties xmlns:cp="http://schemas.openxmlformats.org/package/2006/metadata/core-properties" xmlns:dc="http://purl.org/dc/elements/1.1/" xmlns:dcterms="http://purl.org/dc/terms/" xmlns:dcmitype="http://purl.org/dc/dcmitype/" xmlns:xsi="http://www.w3.org/2001/XMLSchema-instance">
-  <dc:creator>Un-named</dc:creator>
-  <cp:lastModifiedBy>Suleman Saqib</cp:lastModifiedBy>
-  <cp:revision>2</cp:revision>
-  <dcterms:created xsi:type="dcterms:W3CDTF">2026-05-16T05:50:00Z</dcterms:created>
-  <dcterms:modified xsi:type="dcterms:W3CDTF">2026-05-16T06:16:00Z</dcterms:modified>
-</cp:coreProperties>
-</file>
-
-<file path=word\document.xml><?xml version="1.0" encoding="utf-8"?>
+<file path=word/document.xml><?xml version="1.0" encoding="utf-8"?>
 <w:document xmlns:wpc="http://schemas.microsoft.com/office/word/2010/wordprocessingCanvas" xmlns:cx="http://schemas.microsoft.com/office/drawing/2014/chartex" xmlns:cx1="http://schemas.microsoft.com/office/drawing/2015/9/8/chartex" xmlns:cx2="http://schemas.microsoft.com/office/drawing/2015/10/21/chartex" xmlns:cx3="http://schemas.microsoft.com/office/drawing/2016/5/9/chartex" xmlns:cx4="http://schemas.microsoft.com/office/drawing/2016/5/10/chartex" xmlns:cx5="http://schemas.microsoft.com/office/drawing/2016/5/11/chartex" xmlns:cx6="http://schemas.microsoft.com/office/drawing/2016/5/12/chartex" xmlns:cx7="http://schemas.microsoft.com/office/drawing/2016/5/13/chartex" xmlns:cx8="http://schemas.microsoft.com/office/drawing/2016/5/14/chartex" xmlns:mc="http://schemas.openxmlformats.org/markup-compatibility/2006" xmlns:aink="http://schemas.microsoft.com/office/drawing/2016/ink" xmlns:am3d="http://schemas.microsoft.com/office/drawing/2017/model3d" xmlns:o="urn:schemas-microsoft-com:office:office" xmlns:r="http://schemas.openxmlformats.org/officeDocument/2006/relationships" xmlns:m="http://schemas.openxmlformats.org/officeDocument/2006/math" xmlns:v="urn:schemas-microsoft-com:vml" xmlns:wp14="http://schemas.microsoft.com/office/word/2010/wordprocessingDrawing" xmlns:wp="http://schemas.openxmlformats.org/drawingml/2006/wordprocessingDrawing" xmlns:w10="urn:schemas-microsoft-com:office:word" xmlns:w="http://schemas.openxmlformats.org/wordprocessingml/2006/main" xmlns:w14="http://schemas.microsoft.com/office/word/2010/wordml" xmlns:w15="http://schemas.microsoft.com/office/word/2012/wordml" xmlns:w16cid="http://schemas.microsoft.com/office/word/2016/wordml/cid" xmlns:w16se="http://schemas.microsoft.com/office/word/2015/wordml/symex" xmlns:wpg="http://schemas.microsoft.com/office/word/2010/wordprocessingGroup" xmlns:wpi="http://schemas.microsoft.com/office/word/2010/wordprocessingInk" xmlns:wne="http://schemas.microsoft.com/office/word/2006/wordml" xmlns:wps="http://schemas.microsoft.com/office/word/2010/wordprocessingShape" mc:Ignorable="w14 w15 w16se w16cid wp14">
   <w:body>
     <w:p>
@@ -360,8 +314,6 @@
       <w:pPr>
         <w:spacing w:after="60"/>
       </w:pPr>
-      <w:bookmarkStart w:id="0" w:name="_GoBack"/>
-      <w:bookmarkEnd w:id="0"/>
     </w:p>
     <w:p>
       <w:pPr>
@@ -454,13 +406,7 @@
         <w:rPr>
           <w:color w:val="2C3E50"/>
         </w:rPr>
-        <w:t>Project for SS Pharmaceuticals. It digitizes core hospital operations including patient management, appointment scheduling, pharmacy inventory, and billing throu</w:t>
-      </w:r>
-      <w:r>
-        <w:rPr>
-          <w:color w:val="2C3E50"/>
-        </w:rPr>
-        <w:t>gh a secure, role-based web dashboard.</w:t>
+        <w:t>Project for SS Pharmaceuticals. It digitizes core hospital operations including patient management, appointment scheduling, pharmacy inventory, and billing through a secure, role-based web dashboard.</w:t>
       </w:r>
     </w:p>
     <w:p>
@@ -613,12 +559,6 @@
         <w:gridCol w:w="4160"/>
       </w:tblGrid>
       <w:tr>
-        <w:tblPrEx>
-          <w:tblCellMar>
-            <w:top w:w="0" w:type="dxa"/>
-            <w:bottom w:w="0" w:type="dxa"/>
-          </w:tblCellMar>
-        </w:tblPrEx>
         <w:tc>
           <w:tcPr>
             <w:tcW w:w="1800" w:type="dxa"/>
@@ -711,12 +651,6 @@
         </w:tc>
       </w:tr>
       <w:tr>
-        <w:tblPrEx>
-          <w:tblCellMar>
-            <w:top w:w="0" w:type="dxa"/>
-            <w:bottom w:w="0" w:type="dxa"/>
-          </w:tblCellMar>
-        </w:tblPrEx>
         <w:tc>
           <w:tcPr>
             <w:tcW w:w="1800" w:type="dxa"/>
@@ -821,12 +755,6 @@
         </w:tc>
       </w:tr>
       <w:tr>
-        <w:tblPrEx>
-          <w:tblCellMar>
-            <w:top w:w="0" w:type="dxa"/>
-            <w:bottom w:w="0" w:type="dxa"/>
-          </w:tblCellMar>
-        </w:tblPrEx>
         <w:tc>
           <w:tcPr>
             <w:tcW w:w="1800" w:type="dxa"/>
@@ -913,12 +841,6 @@
         </w:tc>
       </w:tr>
       <w:tr>
-        <w:tblPrEx>
-          <w:tblCellMar>
-            <w:top w:w="0" w:type="dxa"/>
-            <w:bottom w:w="0" w:type="dxa"/>
-          </w:tblCellMar>
-        </w:tblPrEx>
         <w:tc>
           <w:tcPr>
             <w:tcW w:w="1800" w:type="dxa"/>
@@ -1005,12 +927,6 @@
         </w:tc>
       </w:tr>
       <w:tr>
-        <w:tblPrEx>
-          <w:tblCellMar>
-            <w:top w:w="0" w:type="dxa"/>
-            <w:bottom w:w="0" w:type="dxa"/>
-          </w:tblCellMar>
-        </w:tblPrEx>
         <w:tc>
           <w:tcPr>
             <w:tcW w:w="1800" w:type="dxa"/>
@@ -1107,12 +1023,6 @@
         </w:tc>
       </w:tr>
       <w:tr>
-        <w:tblPrEx>
-          <w:tblCellMar>
-            <w:top w:w="0" w:type="dxa"/>
-            <w:bottom w:w="0" w:type="dxa"/>
-          </w:tblCellMar>
-        </w:tblPrEx>
         <w:tc>
           <w:tcPr>
             <w:tcW w:w="1800" w:type="dxa"/>
@@ -1335,10 +1245,7 @@
       </w:pPr>
       <w:r>
         <w:lastRenderedPageBreak/>
-        <w:t>API Rout</w:t>
-      </w:r>
-      <w:r>
-        <w:t>es</w:t>
+        <w:t>API Routes</w:t>
       </w:r>
     </w:p>
     <w:p>
@@ -1368,12 +1275,6 @@
         <w:gridCol w:w="5760"/>
       </w:tblGrid>
       <w:tr>
-        <w:tblPrEx>
-          <w:tblCellMar>
-            <w:top w:w="0" w:type="dxa"/>
-            <w:bottom w:w="0" w:type="dxa"/>
-          </w:tblCellMar>
-        </w:tblPrEx>
         <w:tc>
           <w:tcPr>
             <w:tcW w:w="3500" w:type="dxa"/>
@@ -1436,12 +1337,6 @@
         </w:tc>
       </w:tr>
       <w:tr>
-        <w:tblPrEx>
-          <w:tblCellMar>
-            <w:top w:w="0" w:type="dxa"/>
-            <w:bottom w:w="0" w:type="dxa"/>
-          </w:tblCellMar>
-        </w:tblPrEx>
         <w:tc>
           <w:tcPr>
             <w:tcW w:w="3500" w:type="dxa"/>
@@ -1518,12 +1413,6 @@
         </w:tc>
       </w:tr>
       <w:tr>
-        <w:tblPrEx>
-          <w:tblCellMar>
-            <w:top w:w="0" w:type="dxa"/>
-            <w:bottom w:w="0" w:type="dxa"/>
-          </w:tblCellMar>
-        </w:tblPrEx>
         <w:tc>
           <w:tcPr>
             <w:tcW w:w="3500" w:type="dxa"/>
@@ -1600,12 +1489,6 @@
         </w:tc>
       </w:tr>
       <w:tr>
-        <w:tblPrEx>
-          <w:tblCellMar>
-            <w:top w:w="0" w:type="dxa"/>
-            <w:bottom w:w="0" w:type="dxa"/>
-          </w:tblCellMar>
-        </w:tblPrEx>
         <w:tc>
           <w:tcPr>
             <w:tcW w:w="3500" w:type="dxa"/>
@@ -1682,12 +1565,6 @@
         </w:tc>
       </w:tr>
       <w:tr>
-        <w:tblPrEx>
-          <w:tblCellMar>
-            <w:top w:w="0" w:type="dxa"/>
-            <w:bottom w:w="0" w:type="dxa"/>
-          </w:tblCellMar>
-        </w:tblPrEx>
         <w:tc>
           <w:tcPr>
             <w:tcW w:w="3500" w:type="dxa"/>
@@ -1764,12 +1641,6 @@
         </w:tc>
       </w:tr>
       <w:tr>
-        <w:tblPrEx>
-          <w:tblCellMar>
-            <w:top w:w="0" w:type="dxa"/>
-            <w:bottom w:w="0" w:type="dxa"/>
-          </w:tblCellMar>
-        </w:tblPrEx>
         <w:tc>
           <w:tcPr>
             <w:tcW w:w="3500" w:type="dxa"/>
@@ -1846,12 +1717,6 @@
         </w:tc>
       </w:tr>
       <w:tr>
-        <w:tblPrEx>
-          <w:tblCellMar>
-            <w:top w:w="0" w:type="dxa"/>
-            <w:bottom w:w="0" w:type="dxa"/>
-          </w:tblCellMar>
-        </w:tblPrEx>
         <w:tc>
           <w:tcPr>
             <w:tcW w:w="3500" w:type="dxa"/>
@@ -1987,12 +1852,6 @@
         <w:gridCol w:w="6760"/>
       </w:tblGrid>
       <w:tr>
-        <w:tblPrEx>
-          <w:tblCellMar>
-            <w:top w:w="0" w:type="dxa"/>
-            <w:bottom w:w="0" w:type="dxa"/>
-          </w:tblCellMar>
-        </w:tblPrEx>
         <w:tc>
           <w:tcPr>
             <w:tcW w:w="2500" w:type="dxa"/>
@@ -2055,12 +1914,6 @@
         </w:tc>
       </w:tr>
       <w:tr>
-        <w:tblPrEx>
-          <w:tblCellMar>
-            <w:top w:w="0" w:type="dxa"/>
-            <w:bottom w:w="0" w:type="dxa"/>
-          </w:tblCellMar>
-        </w:tblPrEx>
         <w:tc>
           <w:tcPr>
             <w:tcW w:w="2500" w:type="dxa"/>
@@ -2119,12 +1972,6 @@
         </w:tc>
       </w:tr>
       <w:tr>
-        <w:tblPrEx>
-          <w:tblCellMar>
-            <w:top w:w="0" w:type="dxa"/>
-            <w:bottom w:w="0" w:type="dxa"/>
-          </w:tblCellMar>
-        </w:tblPrEx>
         <w:tc>
           <w:tcPr>
             <w:tcW w:w="2500" w:type="dxa"/>
@@ -2183,12 +2030,6 @@
         </w:tc>
       </w:tr>
       <w:tr>
-        <w:tblPrEx>
-          <w:tblCellMar>
-            <w:top w:w="0" w:type="dxa"/>
-            <w:bottom w:w="0" w:type="dxa"/>
-          </w:tblCellMar>
-        </w:tblPrEx>
         <w:tc>
           <w:tcPr>
             <w:tcW w:w="2500" w:type="dxa"/>
@@ -2247,12 +2088,6 @@
         </w:tc>
       </w:tr>
       <w:tr>
-        <w:tblPrEx>
-          <w:tblCellMar>
-            <w:top w:w="0" w:type="dxa"/>
-            <w:bottom w:w="0" w:type="dxa"/>
-          </w:tblCellMar>
-        </w:tblPrEx>
         <w:tc>
           <w:tcPr>
             <w:tcW w:w="2500" w:type="dxa"/>
@@ -2311,12 +2146,6 @@
         </w:tc>
       </w:tr>
       <w:tr>
-        <w:tblPrEx>
-          <w:tblCellMar>
-            <w:top w:w="0" w:type="dxa"/>
-            <w:bottom w:w="0" w:type="dxa"/>
-          </w:tblCellMar>
-        </w:tblPrEx>
         <w:tc>
           <w:tcPr>
             <w:tcW w:w="2500" w:type="dxa"/>
@@ -2375,12 +2204,6 @@
         </w:tc>
       </w:tr>
       <w:tr>
-        <w:tblPrEx>
-          <w:tblCellMar>
-            <w:top w:w="0" w:type="dxa"/>
-            <w:bottom w:w="0" w:type="dxa"/>
-          </w:tblCellMar>
-        </w:tblPrEx>
         <w:tc>
           <w:tcPr>
             <w:tcW w:w="2500" w:type="dxa"/>
@@ -2439,12 +2262,6 @@
         </w:tc>
       </w:tr>
       <w:tr>
-        <w:tblPrEx>
-          <w:tblCellMar>
-            <w:top w:w="0" w:type="dxa"/>
-            <w:bottom w:w="0" w:type="dxa"/>
-          </w:tblCellMar>
-        </w:tblPrEx>
         <w:tc>
           <w:tcPr>
             <w:tcW w:w="2500" w:type="dxa"/>
@@ -2503,12 +2320,6 @@
         </w:tc>
       </w:tr>
       <w:tr>
-        <w:tblPrEx>
-          <w:tblCellMar>
-            <w:top w:w="0" w:type="dxa"/>
-            <w:bottom w:w="0" w:type="dxa"/>
-          </w:tblCellMar>
-        </w:tblPrEx>
         <w:tc>
           <w:tcPr>
             <w:tcW w:w="2500" w:type="dxa"/>
@@ -2572,7 +2383,7 @@
         <w:spacing w:after="80"/>
       </w:pPr>
     </w:p>
-    <w:p xmlns:w="http://schemas.openxmlformats.org/wordprocessingml/2006/main">
+    <w:p>
       <w:pPr>
         <w:pStyle w:val="Heading2"/>
       </w:pPr>
@@ -2580,12 +2391,15 @@
         <w:t>5.1 Database PL/SQL Objects &amp; Optimizations</w:t>
       </w:r>
     </w:p>
-    <w:p xmlns:w="http://schemas.openxmlformats.org/wordprocessingml/2006/main">
-      <w:r>
-        <w:t>To enhance security, enforce business rules directly at the data layer, and optimize query latency, the database layer was upgraded with PL/SQL database objects including Views, Stored Procedures, Cursors, Triggers, and Exception Handling.</w:t>
-      </w:r>
-    </w:p>
-    <w:p xmlns:w="http://schemas.openxmlformats.org/wordprocessingml/2006/main">
+    <w:p>
+      <w:r>
+        <w:t xml:space="preserve">To enhance security, enforce business rules directly at the data layer, and optimize query latency, the database layer was upgraded with PL/SQL database objects including </w:t>
+      </w:r>
+      <w:r>
+        <w:t>Views, Stored Procedures, Cursors, Triggers, and Exception Handling.</w:t>
+      </w:r>
+    </w:p>
+    <w:p>
       <w:r>
         <w:rPr>
           <w:b/>
@@ -2593,27 +2407,31 @@
         <w:t>Database Views</w:t>
       </w:r>
     </w:p>
-    <w:p xmlns:w="http://schemas.openxmlformats.org/wordprocessingml/2006/main">
+    <w:p>
       <w:r>
         <w:t>- patient_details_v: Left-joins patients with their active admission status, current bed/ward details, and their attending doctor name to simplify frontend views.</w:t>
       </w:r>
     </w:p>
-    <w:p xmlns:w="http://schemas.openxmlformats.org/wordprocessingml/2006/main">
-      <w:r>
-        <w:t>- appointment_details_v: Merges appointments with patient profile details, doctor designations, and departments for cleaner list retrieves.</w:t>
-      </w:r>
-    </w:p>
-    <w:p xmlns:w="http://schemas.openxmlformats.org/wordprocessingml/2006/main">
+    <w:p>
+      <w:r>
+        <w:t>- appoint</w:t>
+      </w:r>
+      <w:r>
+        <w:t>ment_details_v: Merges appointments with patient profile details, doctor designations, and departments for cleaner list retrieves.</w:t>
+      </w:r>
+    </w:p>
+    <w:p>
       <w:r>
         <w:t>- billing_summary_v: Combines patient billing records with contact info and dynamically computes remaining invoice balances.</w:t>
       </w:r>
     </w:p>
-    <w:p xmlns:w="http://schemas.openxmlformats.org/wordprocessingml/2006/main">
-      <w:r>
+    <w:p>
+      <w:r>
+        <w:lastRenderedPageBreak/>
         <w:t>- medicine_inventory_v: Categorizes stock levels into 'ok', 'low', or 'out_of_stock' status based on min_quantity thresholds.</w:t>
       </w:r>
     </w:p>
-    <w:p xmlns:w="http://schemas.openxmlformats.org/wordprocessingml/2006/main">
+    <w:p>
       <w:r>
         <w:rPr>
           <w:b/>
@@ -2621,30 +2439,45 @@
         <w:t>Stored Procedures with Cursors &amp; Custom Exception Handling</w:t>
       </w:r>
     </w:p>
-    <w:p xmlns:w="http://schemas.openxmlformats.org/wordprocessingml/2006/main">
-      <w:r>
-        <w:t>- sp_add_prescription: A transactional procedure that validates patients, checks doctor active status, validates medicine stock, inserts the prescription, and decrements stock. If stock is insufficient, it raises a custom application error (-20001) that is trapped and handled by the Node.js API.</w:t>
-      </w:r>
-    </w:p>
-    <w:p xmlns:w="http://schemas.openxmlformats.org/wordprocessingml/2006/main">
-      <w:r>
-        <w:t>- sp_discharge_patient: Automatically discharges an inpatient and calculates room, appointment, and pharmacy charges. It uses Cursors to aggregate all related treatments, calculate the room charge based on stay duration, and automatically insert the corresponding billing record.</w:t>
-      </w:r>
-    </w:p>
-    <w:p xmlns:w="http://schemas.openxmlformats.org/wordprocessingml/2006/main">
+    <w:p>
+      <w:r>
+        <w:t>- sp_add_prescription: A transactional procedure that validates patient</w:t>
+      </w:r>
+      <w:r>
+        <w:t>s, checks doctor active status, validates medicine stock, inserts the prescription, and decrements stock. If stock is insufficient, it raises a custom application error (-20001) that is trapped and handled by the Node.js API.</w:t>
+      </w:r>
+    </w:p>
+    <w:p>
+      <w:r>
+        <w:t>- sp_discharge_patient: Automa</w:t>
+      </w:r>
+      <w:r>
+        <w:t>tically discharges an inpatient and calculates room, appointment, and pharmacy charges. It uses Cursors to aggregate all related treatments, calculate the room charge based on stay duration, and automatically insert the corresponding billing record.</w:t>
+      </w:r>
+    </w:p>
+    <w:p>
       <w:r>
         <w:rPr>
           <w:b/>
         </w:rPr>
-        <w:t>Database Triggers</w:t>
-      </w:r>
-    </w:p>
-    <w:p xmlns:w="http://schemas.openxmlformats.org/wordprocessingml/2006/main">
-      <w:r>
-        <w:t>- trg_update_billing_status: A BEFORE INSERT OR UPDATE trigger on the billing table that automatically calculates and sets status ('paid', 'partial', 'pending') based on paid_amount versus total_amount, removing redundancy in Node.js controller files.</w:t>
-      </w:r>
-    </w:p>
-    <w:p xmlns:w="http://schemas.openxmlformats.org/wordprocessingml/2006/main"/>
+        <w:t>Databa</w:t>
+      </w:r>
+      <w:r>
+        <w:rPr>
+          <w:b/>
+        </w:rPr>
+        <w:t>se Triggers</w:t>
+      </w:r>
+    </w:p>
+    <w:p>
+      <w:r>
+        <w:t>- trg_update_billing_status: A BEFORE INSERT OR UPDATE trigger on the billing table that automatically calculates and sets status ('paid', 'partial', 'pending') based on paid_amount versus total_amount, removing redundancy in Node.js controller</w:t>
+      </w:r>
+      <w:r>
+        <w:t xml:space="preserve"> files.</w:t>
+      </w:r>
+    </w:p>
+    <w:p/>
     <w:p>
       <w:pPr>
         <w:pStyle w:val="Heading1"/>
@@ -2688,12 +2521,6 @@
         <w:gridCol w:w="6760"/>
       </w:tblGrid>
       <w:tr>
-        <w:tblPrEx>
-          <w:tblCellMar>
-            <w:top w:w="0" w:type="dxa"/>
-            <w:bottom w:w="0" w:type="dxa"/>
-          </w:tblCellMar>
-        </w:tblPrEx>
         <w:tc>
           <w:tcPr>
             <w:tcW w:w="2500" w:type="dxa"/>
@@ -2756,12 +2583,6 @@
         </w:tc>
       </w:tr>
       <w:tr>
-        <w:tblPrEx>
-          <w:tblCellMar>
-            <w:top w:w="0" w:type="dxa"/>
-            <w:bottom w:w="0" w:type="dxa"/>
-          </w:tblCellMar>
-        </w:tblPrEx>
         <w:tc>
           <w:tcPr>
             <w:tcW w:w="2500" w:type="dxa"/>
@@ -2820,12 +2641,6 @@
         </w:tc>
       </w:tr>
       <w:tr>
-        <w:tblPrEx>
-          <w:tblCellMar>
-            <w:top w:w="0" w:type="dxa"/>
-            <w:bottom w:w="0" w:type="dxa"/>
-          </w:tblCellMar>
-        </w:tblPrEx>
         <w:tc>
           <w:tcPr>
             <w:tcW w:w="2500" w:type="dxa"/>
@@ -2902,12 +2717,6 @@
         </w:tc>
       </w:tr>
       <w:tr>
-        <w:tblPrEx>
-          <w:tblCellMar>
-            <w:top w:w="0" w:type="dxa"/>
-            <w:bottom w:w="0" w:type="dxa"/>
-          </w:tblCellMar>
-        </w:tblPrEx>
         <w:tc>
           <w:tcPr>
             <w:tcW w:w="2500" w:type="dxa"/>
@@ -2966,12 +2775,6 @@
         </w:tc>
       </w:tr>
       <w:tr>
-        <w:tblPrEx>
-          <w:tblCellMar>
-            <w:top w:w="0" w:type="dxa"/>
-            <w:bottom w:w="0" w:type="dxa"/>
-          </w:tblCellMar>
-        </w:tblPrEx>
         <w:tc>
           <w:tcPr>
             <w:tcW w:w="2500" w:type="dxa"/>
@@ -3030,12 +2833,6 @@
         </w:tc>
       </w:tr>
       <w:tr>
-        <w:tblPrEx>
-          <w:tblCellMar>
-            <w:top w:w="0" w:type="dxa"/>
-            <w:bottom w:w="0" w:type="dxa"/>
-          </w:tblCellMar>
-        </w:tblPrEx>
         <w:tc>
           <w:tcPr>
             <w:tcW w:w="2500" w:type="dxa"/>
@@ -3060,7 +2857,6 @@
                 <w:sz w:val="20"/>
                 <w:szCs w:val="20"/>
               </w:rPr>
-              <w:lastRenderedPageBreak/>
               <w:t>Staff Management</w:t>
             </w:r>
           </w:p>
@@ -3095,12 +2891,6 @@
         </w:tc>
       </w:tr>
       <w:tr>
-        <w:tblPrEx>
-          <w:tblCellMar>
-            <w:top w:w="0" w:type="dxa"/>
-            <w:bottom w:w="0" w:type="dxa"/>
-          </w:tblCellMar>
-        </w:tblPrEx>
         <w:tc>
           <w:tcPr>
             <w:tcW w:w="2500" w:type="dxa"/>
@@ -3159,12 +2949,6 @@
         </w:tc>
       </w:tr>
       <w:tr>
-        <w:tblPrEx>
-          <w:tblCellMar>
-            <w:top w:w="0" w:type="dxa"/>
-            <w:bottom w:w="0" w:type="dxa"/>
-          </w:tblCellMar>
-        </w:tblPrEx>
         <w:tc>
           <w:tcPr>
             <w:tcW w:w="2500" w:type="dxa"/>
@@ -3223,12 +3007,6 @@
         </w:tc>
       </w:tr>
       <w:tr>
-        <w:tblPrEx>
-          <w:tblCellMar>
-            <w:top w:w="0" w:type="dxa"/>
-            <w:bottom w:w="0" w:type="dxa"/>
-          </w:tblCellMar>
-        </w:tblPrEx>
         <w:tc>
           <w:tcPr>
             <w:tcW w:w="2500" w:type="dxa"/>
@@ -3287,12 +3065,6 @@
         </w:tc>
       </w:tr>
       <w:tr>
-        <w:tblPrEx>
-          <w:tblCellMar>
-            <w:top w:w="0" w:type="dxa"/>
-            <w:bottom w:w="0" w:type="dxa"/>
-          </w:tblCellMar>
-        </w:tblPrEx>
         <w:tc>
           <w:tcPr>
             <w:tcW w:w="2500" w:type="dxa"/>
@@ -3447,13 +3219,7 @@
         <w:rPr>
           <w:color w:val="2C3E50"/>
         </w:rPr>
-        <w:t xml:space="preserve">CORS restricted to frontend </w:t>
-      </w:r>
-      <w:r>
-        <w:rPr>
-          <w:color w:val="2C3E50"/>
-        </w:rPr>
-        <w:t>origin (http://localhost:5173).</w:t>
+        <w:t>CORS restricted to frontend origin (http://localhost:5173).</w:t>
       </w:r>
     </w:p>
     <w:p>
@@ -3482,6 +3248,7 @@
         <w:pStyle w:val="Heading1"/>
       </w:pPr>
       <w:r>
+        <w:lastRenderedPageBreak/>
         <w:t>8. Installation &amp; Setup</w:t>
       </w:r>
     </w:p>
@@ -3820,13 +3587,7 @@
         <w:rPr>
           <w:color w:val="2C3E50"/>
         </w:rPr>
-        <w:t>The HMS successfully digitalizes hospital operations through a clean, secure, and scalable full-stack application. Built with React, Node.js, and</w:t>
-      </w:r>
-      <w:r>
-        <w:rPr>
-          <w:color w:val="2C3E50"/>
-        </w:rPr>
-        <w:t xml:space="preserve"> Oracle 19c, it covers the complete hospital workflow from patient registration to billing, and serves as a strong foundation for future enhancements such as multi-role portals, real-time notifications, and mobile access.</w:t>
+        <w:t>The HMS successfully digitalizes hospital operations through a clean, secure, and scalable full-stack application. Built with React, Node.js, and Oracle 19c, it covers the complete hospital workflow from patient registration to billing, and serves as a strong foundation for future enhancements such as multi-role portals, real-time notifications, and mobile access.</w:t>
       </w:r>
     </w:p>
     <w:p>
@@ -3851,7 +3612,98 @@
       <w:pPr>
         <w:pStyle w:val="Heading3"/>
       </w:pPr>
-      <w:r>
+    </w:p>
+    <w:p>
+      <w:pPr>
+        <w:pStyle w:val="Heading3"/>
+      </w:pPr>
+    </w:p>
+    <w:p>
+      <w:pPr>
+        <w:pStyle w:val="Heading3"/>
+      </w:pPr>
+    </w:p>
+    <w:p>
+      <w:pPr>
+        <w:pStyle w:val="Heading3"/>
+      </w:pPr>
+    </w:p>
+    <w:p>
+      <w:pPr>
+        <w:pStyle w:val="Heading3"/>
+      </w:pPr>
+    </w:p>
+    <w:p>
+      <w:pPr>
+        <w:pStyle w:val="Heading3"/>
+      </w:pPr>
+    </w:p>
+    <w:p>
+      <w:pPr>
+        <w:pStyle w:val="Heading3"/>
+      </w:pPr>
+    </w:p>
+    <w:p>
+      <w:pPr>
+        <w:pStyle w:val="Heading3"/>
+      </w:pPr>
+    </w:p>
+    <w:p>
+      <w:pPr>
+        <w:pStyle w:val="Heading3"/>
+      </w:pPr>
+    </w:p>
+    <w:p>
+      <w:pPr>
+        <w:pStyle w:val="Heading3"/>
+      </w:pPr>
+    </w:p>
+    <w:p>
+      <w:pPr>
+        <w:pStyle w:val="Heading3"/>
+      </w:pPr>
+    </w:p>
+    <w:p>
+      <w:pPr>
+        <w:pStyle w:val="Heading3"/>
+      </w:pPr>
+    </w:p>
+    <w:p>
+      <w:pPr>
+        <w:pStyle w:val="Heading3"/>
+      </w:pPr>
+    </w:p>
+    <w:p>
+      <w:pPr>
+        <w:pStyle w:val="Heading3"/>
+      </w:pPr>
+    </w:p>
+    <w:p>
+      <w:pPr>
+        <w:pStyle w:val="Heading3"/>
+      </w:pPr>
+    </w:p>
+    <w:p>
+      <w:pPr>
+        <w:pStyle w:val="Heading3"/>
+      </w:pPr>
+    </w:p>
+    <w:p>
+      <w:pPr>
+        <w:pStyle w:val="Heading3"/>
+      </w:pPr>
+    </w:p>
+    <w:p>
+      <w:pPr>
+        <w:pStyle w:val="Heading3"/>
+      </w:pPr>
+    </w:p>
+    <w:p>
+      <w:pPr>
+        <w:pStyle w:val="Heading3"/>
+      </w:pPr>
+      <w:r>
+        <w:lastRenderedPageBreak/>
         <w:t>Output</w:t>
       </w:r>
     </w:p>
@@ -3864,7 +3716,7 @@
           <w:noProof/>
         </w:rPr>
         <w:drawing>
-          <wp:inline distT="0" distB="0" distL="0" distR="0" wp14:anchorId="655126F9" wp14:editId="2622E4A1">
+          <wp:inline distT="0" distB="0" distL="0" distR="0" wp14:anchorId="0B3F4E3D" wp14:editId="16A9404C">
             <wp:extent cx="6172200" cy="3304540"/>
             <wp:effectExtent l="0" t="0" r="0" b="0"/>
             <wp:docPr id="1" name="Picture 1"/>
@@ -3904,6 +3756,11 @@
       <w:pPr>
         <w:spacing w:before="200"/>
       </w:pPr>
+    </w:p>
+    <w:p>
+      <w:pPr>
+        <w:spacing w:before="200"/>
+      </w:pPr>
       <w:r>
         <w:t>Login Page</w:t>
       </w:r>
@@ -3912,12 +3769,17 @@
       <w:pPr>
         <w:spacing w:before="200"/>
       </w:pPr>
+    </w:p>
+    <w:p>
+      <w:pPr>
+        <w:spacing w:before="200"/>
+      </w:pPr>
       <w:r>
         <w:rPr>
           <w:noProof/>
         </w:rPr>
         <w:drawing>
-          <wp:inline distT="0" distB="0" distL="0" distR="0" wp14:anchorId="6E6E642B" wp14:editId="317AB672">
+          <wp:inline distT="0" distB="0" distL="0" distR="0" wp14:anchorId="761457AE" wp14:editId="0574B7A2">
             <wp:extent cx="6172200" cy="3307715"/>
             <wp:effectExtent l="0" t="0" r="0" b="6985"/>
             <wp:docPr id="2" name="Picture 2"/>
@@ -3962,6 +3824,18 @@
       <w:pPr>
         <w:spacing w:before="200"/>
       </w:pPr>
+      <w:r>
+        <w:lastRenderedPageBreak/>
+        <w:t xml:space="preserve">Logged </w:t>
+      </w:r>
+      <w:proofErr w:type="gramStart"/>
+      <w:r>
+        <w:t>In</w:t>
+      </w:r>
+      <w:proofErr w:type="gramEnd"/>
+      <w:r>
+        <w:t xml:space="preserve"> Interface</w:t>
+      </w:r>
     </w:p>
     <w:p>
       <w:pPr>
@@ -3973,30 +3847,11 @@
         <w:spacing w:before="200"/>
       </w:pPr>
       <w:r>
-        <w:t xml:space="preserve">Logged </w:t>
-      </w:r>
-      <w:proofErr w:type="gramStart"/>
-      <w:r>
-        <w:t>In</w:t>
-      </w:r>
-      <w:proofErr w:type="gramEnd"/>
-      <w:r>
-        <w:t xml:space="preserve"> Interface</w:t>
-      </w:r>
-    </w:p>
-    <w:p>
-      <w:pPr>
-        <w:spacing w:before="200"/>
-      </w:pPr>
-      <w:r>
-        <w:rPr>
-          <w:noProof/>
-        </w:rPr>
         <w:drawing>
-          <wp:inline distT="0" distB="0" distL="0" distR="0" wp14:anchorId="0E4C98CC" wp14:editId="2E13A9B6">
-            <wp:extent cx="6172200" cy="3307715"/>
-            <wp:effectExtent l="0" t="0" r="0" b="6985"/>
-            <wp:docPr id="3" name="Picture 3"/>
+          <wp:inline distT="0" distB="0" distL="0" distR="0" wp14:anchorId="578228C7" wp14:editId="0662F8DC">
+            <wp:extent cx="6172200" cy="3300730"/>
+            <wp:effectExtent l="0" t="0" r="0" b="0"/>
+            <wp:docPr id="11" name="Picture 11"/>
             <wp:cNvGraphicFramePr>
               <a:graphicFrameLocks xmlns:a="http://schemas.openxmlformats.org/drawingml/2006/main" noChangeAspect="1"/>
             </wp:cNvGraphicFramePr>
@@ -4016,7 +3871,7 @@
                   <pic:spPr>
                     <a:xfrm>
                       <a:off x="0" y="0"/>
-                      <a:ext cx="6172200" cy="3307715"/>
+                      <a:ext cx="6172200" cy="3300730"/>
                     </a:xfrm>
                     <a:prstGeom prst="rect">
                       <a:avLst/>
@@ -4033,6 +3888,11 @@
       <w:pPr>
         <w:spacing w:before="200"/>
       </w:pPr>
+    </w:p>
+    <w:p>
+      <w:pPr>
+        <w:spacing w:before="200"/>
+      </w:pPr>
       <w:r>
         <w:t>Dashboard Interface</w:t>
       </w:r>
@@ -4041,15 +3901,17 @@
       <w:pPr>
         <w:spacing w:before="200"/>
       </w:pPr>
-      <w:r>
-        <w:rPr>
-          <w:noProof/>
-        </w:rPr>
+    </w:p>
+    <w:p>
+      <w:pPr>
+        <w:spacing w:before="200"/>
+      </w:pPr>
+      <w:r>
         <w:drawing>
-          <wp:inline distT="0" distB="0" distL="0" distR="0" wp14:anchorId="6895715F" wp14:editId="08ABD51A">
-            <wp:extent cx="6172200" cy="3310890"/>
-            <wp:effectExtent l="0" t="0" r="0" b="3810"/>
-            <wp:docPr id="4" name="Picture 4"/>
+          <wp:inline distT="0" distB="0" distL="0" distR="0" wp14:anchorId="1355D7B4" wp14:editId="2B421E4B">
+            <wp:extent cx="6172200" cy="3300095"/>
+            <wp:effectExtent l="0" t="0" r="0" b="0"/>
+            <wp:docPr id="12" name="Picture 12"/>
             <wp:cNvGraphicFramePr>
               <a:graphicFrameLocks xmlns:a="http://schemas.openxmlformats.org/drawingml/2006/main" noChangeAspect="1"/>
             </wp:cNvGraphicFramePr>
@@ -4069,7 +3931,7 @@
                   <pic:spPr>
                     <a:xfrm>
                       <a:off x="0" y="0"/>
-                      <a:ext cx="6172200" cy="3310890"/>
+                      <a:ext cx="6172200" cy="3300095"/>
                     </a:xfrm>
                     <a:prstGeom prst="rect">
                       <a:avLst/>
@@ -4086,6 +3948,10 @@
       <w:pPr>
         <w:spacing w:before="200"/>
       </w:pPr>
+      <w:r>
+        <w:lastRenderedPageBreak/>
+        <w:t>Patient Page</w:t>
+      </w:r>
     </w:p>
     <w:p>
       <w:pPr>
@@ -4096,28 +3962,12 @@
       <w:pPr>
         <w:spacing w:before="200"/>
       </w:pPr>
-    </w:p>
-    <w:p>
-      <w:pPr>
-        <w:spacing w:before="200"/>
-      </w:pPr>
-      <w:r>
-        <w:t>Patient Page</w:t>
-      </w:r>
-    </w:p>
-    <w:p>
-      <w:pPr>
-        <w:spacing w:before="200"/>
-      </w:pPr>
-      <w:r>
-        <w:rPr>
-          <w:noProof/>
-        </w:rPr>
+      <w:r>
         <w:drawing>
-          <wp:inline distT="0" distB="0" distL="0" distR="0" wp14:anchorId="433F60C5" wp14:editId="235541C9">
-            <wp:extent cx="6172200" cy="3357880"/>
-            <wp:effectExtent l="0" t="0" r="0" b="0"/>
-            <wp:docPr id="5" name="Picture 5"/>
+          <wp:inline distT="0" distB="0" distL="0" distR="0" wp14:anchorId="59409543" wp14:editId="55A03B02">
+            <wp:extent cx="6172200" cy="3290570"/>
+            <wp:effectExtent l="0" t="0" r="0" b="5080"/>
+            <wp:docPr id="13" name="Picture 13"/>
             <wp:cNvGraphicFramePr>
               <a:graphicFrameLocks xmlns:a="http://schemas.openxmlformats.org/drawingml/2006/main" noChangeAspect="1"/>
             </wp:cNvGraphicFramePr>
@@ -4137,7 +3987,7 @@
                   <pic:spPr>
                     <a:xfrm>
                       <a:off x="0" y="0"/>
-                      <a:ext cx="6172200" cy="3357880"/>
+                      <a:ext cx="6172200" cy="3290570"/>
                     </a:xfrm>
                     <a:prstGeom prst="rect">
                       <a:avLst/>
@@ -4154,6 +4004,11 @@
       <w:pPr>
         <w:spacing w:before="200"/>
       </w:pPr>
+    </w:p>
+    <w:p>
+      <w:pPr>
+        <w:spacing w:before="200"/>
+      </w:pPr>
       <w:r>
         <w:t>Registration Page</w:t>
       </w:r>
@@ -4162,15 +4017,17 @@
       <w:pPr>
         <w:spacing w:before="200"/>
       </w:pPr>
-      <w:r>
-        <w:rPr>
-          <w:noProof/>
-        </w:rPr>
+    </w:p>
+    <w:p>
+      <w:pPr>
+        <w:spacing w:before="200"/>
+      </w:pPr>
+      <w:r>
         <w:drawing>
-          <wp:inline distT="0" distB="0" distL="0" distR="0" wp14:anchorId="2F0326AF" wp14:editId="61DB0508">
-            <wp:extent cx="6172200" cy="3314065"/>
-            <wp:effectExtent l="0" t="0" r="0" b="635"/>
-            <wp:docPr id="6" name="Picture 6"/>
+          <wp:inline distT="0" distB="0" distL="0" distR="0" wp14:anchorId="4B9582F1" wp14:editId="358280BB">
+            <wp:extent cx="6172200" cy="3274695"/>
+            <wp:effectExtent l="0" t="0" r="0" b="1905"/>
+            <wp:docPr id="14" name="Picture 14"/>
             <wp:cNvGraphicFramePr>
               <a:graphicFrameLocks xmlns:a="http://schemas.openxmlformats.org/drawingml/2006/main" noChangeAspect="1"/>
             </wp:cNvGraphicFramePr>
@@ -4190,7 +4047,7 @@
                   <pic:spPr>
                     <a:xfrm>
                       <a:off x="0" y="0"/>
-                      <a:ext cx="6172200" cy="3314065"/>
+                      <a:ext cx="6172200" cy="3274695"/>
                     </a:xfrm>
                     <a:prstGeom prst="rect">
                       <a:avLst/>
@@ -4207,6 +4064,10 @@
       <w:pPr>
         <w:spacing w:before="200"/>
       </w:pPr>
+      <w:r>
+        <w:lastRenderedPageBreak/>
+        <w:t>Appointment</w:t>
+      </w:r>
     </w:p>
     <w:p>
       <w:pPr>
@@ -4218,22 +4079,11 @@
         <w:spacing w:before="200"/>
       </w:pPr>
       <w:r>
-        <w:t>Appointment</w:t>
-      </w:r>
-    </w:p>
-    <w:p>
-      <w:pPr>
-        <w:spacing w:before="200"/>
-      </w:pPr>
-      <w:r>
-        <w:rPr>
-          <w:noProof/>
-        </w:rPr>
         <w:drawing>
-          <wp:inline distT="0" distB="0" distL="0" distR="0" wp14:anchorId="7ED64D28" wp14:editId="4F535356">
-            <wp:extent cx="6172200" cy="3300095"/>
+          <wp:inline distT="0" distB="0" distL="0" distR="0" wp14:anchorId="432568AB" wp14:editId="5A2525FA">
+            <wp:extent cx="6172200" cy="3319780"/>
             <wp:effectExtent l="0" t="0" r="0" b="0"/>
-            <wp:docPr id="7" name="Picture 7"/>
+            <wp:docPr id="15" name="Picture 15"/>
             <wp:cNvGraphicFramePr>
               <a:graphicFrameLocks xmlns:a="http://schemas.openxmlformats.org/drawingml/2006/main" noChangeAspect="1"/>
             </wp:cNvGraphicFramePr>
@@ -4253,7 +4103,7 @@
                   <pic:spPr>
                     <a:xfrm>
                       <a:off x="0" y="0"/>
-                      <a:ext cx="6172200" cy="3300095"/>
+                      <a:ext cx="6172200" cy="3319780"/>
                     </a:xfrm>
                     <a:prstGeom prst="rect">
                       <a:avLst/>
@@ -4270,6 +4120,11 @@
       <w:pPr>
         <w:spacing w:before="200"/>
       </w:pPr>
+    </w:p>
+    <w:p>
+      <w:pPr>
+        <w:spacing w:before="200"/>
+      </w:pPr>
       <w:r>
         <w:t>Pharmacy</w:t>
       </w:r>
@@ -4278,15 +4133,17 @@
       <w:pPr>
         <w:spacing w:before="200"/>
       </w:pPr>
-      <w:r>
-        <w:rPr>
-          <w:noProof/>
-        </w:rPr>
+    </w:p>
+    <w:p>
+      <w:pPr>
+        <w:spacing w:before="200"/>
+      </w:pPr>
+      <w:r>
         <w:drawing>
-          <wp:inline distT="0" distB="0" distL="0" distR="0" wp14:anchorId="3953760B" wp14:editId="23A8ED2F">
-            <wp:extent cx="6172200" cy="3331845"/>
-            <wp:effectExtent l="0" t="0" r="0" b="1905"/>
-            <wp:docPr id="8" name="Picture 8"/>
+          <wp:inline distT="0" distB="0" distL="0" distR="0" wp14:anchorId="47D9CA03" wp14:editId="7F8407B8">
+            <wp:extent cx="6172200" cy="3319780"/>
+            <wp:effectExtent l="0" t="0" r="0" b="0"/>
+            <wp:docPr id="16" name="Picture 16"/>
             <wp:cNvGraphicFramePr>
               <a:graphicFrameLocks xmlns:a="http://schemas.openxmlformats.org/drawingml/2006/main" noChangeAspect="1"/>
             </wp:cNvGraphicFramePr>
@@ -4306,7 +4163,7 @@
                   <pic:spPr>
                     <a:xfrm>
                       <a:off x="0" y="0"/>
-                      <a:ext cx="6172200" cy="3331845"/>
+                      <a:ext cx="6172200" cy="3319780"/>
                     </a:xfrm>
                     <a:prstGeom prst="rect">
                       <a:avLst/>
@@ -4323,29 +4180,26 @@
       <w:pPr>
         <w:spacing w:before="200"/>
       </w:pPr>
+      <w:r>
+        <w:lastRenderedPageBreak/>
+        <w:t>Prescribe</w:t>
+      </w:r>
     </w:p>
     <w:p>
       <w:pPr>
         <w:spacing w:before="200"/>
       </w:pPr>
-      <w:r>
-        <w:lastRenderedPageBreak/>
-        <w:t>Billing System</w:t>
-      </w:r>
     </w:p>
     <w:p>
       <w:pPr>
         <w:spacing w:before="200"/>
       </w:pPr>
       <w:r>
-        <w:rPr>
-          <w:noProof/>
-        </w:rPr>
         <w:drawing>
-          <wp:inline distT="0" distB="0" distL="0" distR="0" wp14:anchorId="4C0F45AB" wp14:editId="40271134">
-            <wp:extent cx="6172200" cy="3333750"/>
-            <wp:effectExtent l="0" t="0" r="0" b="0"/>
-            <wp:docPr id="9" name="Picture 9"/>
+          <wp:inline distT="0" distB="0" distL="0" distR="0" wp14:anchorId="6B725366" wp14:editId="021E9465">
+            <wp:extent cx="6172200" cy="3290570"/>
+            <wp:effectExtent l="0" t="0" r="0" b="5080"/>
+            <wp:docPr id="17" name="Picture 17"/>
             <wp:cNvGraphicFramePr>
               <a:graphicFrameLocks xmlns:a="http://schemas.openxmlformats.org/drawingml/2006/main" noChangeAspect="1"/>
             </wp:cNvGraphicFramePr>
@@ -4365,7 +4219,7 @@
                   <pic:spPr>
                     <a:xfrm>
                       <a:off x="0" y="0"/>
-                      <a:ext cx="6172200" cy="3333750"/>
+                      <a:ext cx="6172200" cy="3290570"/>
                     </a:xfrm>
                     <a:prstGeom prst="rect">
                       <a:avLst/>
@@ -4388,22 +4242,24 @@
         <w:spacing w:before="200"/>
       </w:pPr>
       <w:r>
-        <w:t>Analytics</w:t>
+        <w:t>Billing System</w:t>
       </w:r>
     </w:p>
     <w:p>
       <w:pPr>
         <w:spacing w:before="200"/>
       </w:pPr>
-      <w:r>
-        <w:rPr>
-          <w:noProof/>
-        </w:rPr>
+    </w:p>
+    <w:p>
+      <w:pPr>
+        <w:spacing w:before="200"/>
+      </w:pPr>
+      <w:r>
         <w:drawing>
-          <wp:inline distT="0" distB="0" distL="0" distR="0" wp14:anchorId="2C145FE2" wp14:editId="2DEEC334">
-            <wp:extent cx="6172200" cy="3310890"/>
-            <wp:effectExtent l="0" t="0" r="0" b="3810"/>
-            <wp:docPr id="10" name="Picture 10"/>
+          <wp:inline distT="0" distB="0" distL="0" distR="0" wp14:anchorId="63AC8DA6" wp14:editId="73AB9B94">
+            <wp:extent cx="6172200" cy="3290570"/>
+            <wp:effectExtent l="0" t="0" r="0" b="5080"/>
+            <wp:docPr id="18" name="Picture 18"/>
             <wp:cNvGraphicFramePr>
               <a:graphicFrameLocks xmlns:a="http://schemas.openxmlformats.org/drawingml/2006/main" noChangeAspect="1"/>
             </wp:cNvGraphicFramePr>
@@ -4423,7 +4279,7 @@
                   <pic:spPr>
                     <a:xfrm>
                       <a:off x="0" y="0"/>
-                      <a:ext cx="6172200" cy="3310890"/>
+                      <a:ext cx="6172200" cy="3290570"/>
                     </a:xfrm>
                     <a:prstGeom prst="rect">
                       <a:avLst/>
@@ -4439,6 +4295,64 @@
     <w:p>
       <w:pPr>
         <w:spacing w:before="200"/>
+      </w:pPr>
+      <w:r>
+        <w:lastRenderedPageBreak/>
+        <w:t>Analytics</w:t>
+      </w:r>
+    </w:p>
+    <w:p>
+      <w:pPr>
+        <w:spacing w:before="200"/>
+      </w:pPr>
+      <w:bookmarkStart w:id="0" w:name="_GoBack"/>
+      <w:bookmarkEnd w:id="0"/>
+    </w:p>
+    <w:p>
+      <w:pPr>
+        <w:spacing w:before="200"/>
+      </w:pPr>
+      <w:r>
+        <w:drawing>
+          <wp:inline distT="0" distB="0" distL="0" distR="0" wp14:anchorId="41864A2D" wp14:editId="77B84490">
+            <wp:extent cx="6172200" cy="3303270"/>
+            <wp:effectExtent l="0" t="0" r="0" b="0"/>
+            <wp:docPr id="19" name="Picture 19"/>
+            <wp:cNvGraphicFramePr>
+              <a:graphicFrameLocks xmlns:a="http://schemas.openxmlformats.org/drawingml/2006/main" noChangeAspect="1"/>
+            </wp:cNvGraphicFramePr>
+            <a:graphic xmlns:a="http://schemas.openxmlformats.org/drawingml/2006/main">
+              <a:graphicData uri="http://schemas.openxmlformats.org/drawingml/2006/picture">
+                <pic:pic xmlns:pic="http://schemas.openxmlformats.org/drawingml/2006/picture">
+                  <pic:nvPicPr>
+                    <pic:cNvPr id="1" name=""/>
+                    <pic:cNvPicPr/>
+                  </pic:nvPicPr>
+                  <pic:blipFill>
+                    <a:blip r:embed="rId17"/>
+                    <a:stretch>
+                      <a:fillRect/>
+                    </a:stretch>
+                  </pic:blipFill>
+                  <pic:spPr>
+                    <a:xfrm>
+                      <a:off x="0" y="0"/>
+                      <a:ext cx="6172200" cy="3303270"/>
+                    </a:xfrm>
+                    <a:prstGeom prst="rect">
+                      <a:avLst/>
+                    </a:prstGeom>
+                  </pic:spPr>
+                </pic:pic>
+              </a:graphicData>
+            </a:graphic>
+          </wp:inline>
+        </w:drawing>
+      </w:r>
+    </w:p>
+    <w:p>
+      <w:pPr>
+        <w:spacing w:before="200"/>
         <w:jc w:val="center"/>
         <w:rPr>
           <w:i/>
@@ -4456,8 +4370,8 @@
       </w:r>
     </w:p>
     <w:sectPr>
-      <w:headerReference w:type="default" r:id="rId17"/>
-      <w:footerReference w:type="default" r:id="rId18"/>
+      <w:headerReference w:type="default" r:id="rId18"/>
+      <w:footerReference w:type="default" r:id="rId19"/>
       <w:pgSz w:w="12240" w:h="15840"/>
       <w:pgMar w:top="1440" w:right="1260" w:bottom="1440" w:left="1260" w:header="708" w:footer="708" w:gutter="0"/>
       <w:cols w:space="720"/>
@@ -4467,7 +4381,7 @@
 </w:document>
 </file>
 
-<file path=word\endnotes.xml><?xml version="1.0" encoding="utf-8"?>
+<file path=word/endnotes.xml><?xml version="1.0" encoding="utf-8"?>
 <w:endnotes xmlns:wpc="http://schemas.microsoft.com/office/word/2010/wordprocessingCanvas" xmlns:cx="http://schemas.microsoft.com/office/drawing/2014/chartex" xmlns:cx1="http://schemas.microsoft.com/office/drawing/2015/9/8/chartex" xmlns:cx2="http://schemas.microsoft.com/office/drawing/2015/10/21/chartex" xmlns:cx3="http://schemas.microsoft.com/office/drawing/2016/5/9/chartex" xmlns:cx4="http://schemas.microsoft.com/office/drawing/2016/5/10/chartex" xmlns:cx5="http://schemas.microsoft.com/office/drawing/2016/5/11/chartex" xmlns:cx6="http://schemas.microsoft.com/office/drawing/2016/5/12/chartex" xmlns:cx7="http://schemas.microsoft.com/office/drawing/2016/5/13/chartex" xmlns:cx8="http://schemas.microsoft.com/office/drawing/2016/5/14/chartex" xmlns:mc="http://schemas.openxmlformats.org/markup-compatibility/2006" xmlns:aink="http://schemas.microsoft.com/office/drawing/2016/ink" xmlns:am3d="http://schemas.microsoft.com/office/drawing/2017/model3d" xmlns:o="urn:schemas-microsoft-com:office:office" xmlns:r="http://schemas.openxmlformats.org/officeDocument/2006/relationships" xmlns:m="http://schemas.openxmlformats.org/officeDocument/2006/math" xmlns:v="urn:schemas-microsoft-com:vml" xmlns:wp14="http://schemas.microsoft.com/office/word/2010/wordprocessingDrawing" xmlns:wp="http://schemas.openxmlformats.org/drawingml/2006/wordprocessingDrawing" xmlns:w10="urn:schemas-microsoft-com:office:word" xmlns:w="http://schemas.openxmlformats.org/wordprocessingml/2006/main" xmlns:w14="http://schemas.microsoft.com/office/word/2010/wordml" xmlns:w15="http://schemas.microsoft.com/office/word/2012/wordml" xmlns:w16cid="http://schemas.microsoft.com/office/word/2016/wordml/cid" xmlns:w16se="http://schemas.microsoft.com/office/word/2015/wordml/symex" xmlns:wpg="http://schemas.microsoft.com/office/word/2010/wordprocessingGroup" xmlns:wpi="http://schemas.microsoft.com/office/word/2010/wordprocessingInk" xmlns:wne="http://schemas.microsoft.com/office/word/2006/wordml" xmlns:wps="http://schemas.microsoft.com/office/word/2010/wordprocessingShape" mc:Ignorable="w14 w15 w16se w16cid wp14">
   <w:endnote w:type="separator" w:id="-1">
     <w:p>
@@ -4486,40 +4400,7 @@
 </w:endnotes>
 </file>
 
-<file path=word\fontTable.xml><?xml version="1.0" encoding="utf-8"?>
-<w:fonts xmlns:mc="http://schemas.openxmlformats.org/markup-compatibility/2006" xmlns:r="http://schemas.openxmlformats.org/officeDocument/2006/relationships" xmlns:w="http://schemas.openxmlformats.org/wordprocessingml/2006/main" xmlns:w14="http://schemas.microsoft.com/office/word/2010/wordml" xmlns:w15="http://schemas.microsoft.com/office/word/2012/wordml" xmlns:w16cid="http://schemas.microsoft.com/office/word/2016/wordml/cid" xmlns:w16se="http://schemas.microsoft.com/office/word/2015/wordml/symex" mc:Ignorable="w14 w15 w16se w16cid">
-  <w:font w:name="Arial">
-    <w:panose1 w:val="020B0604020202020204"/>
-    <w:charset w:val="00"/>
-    <w:family w:val="swiss"/>
-    <w:pitch w:val="variable"/>
-    <w:sig w:usb0="E0002EFF" w:usb1="C000785B" w:usb2="00000009" w:usb3="00000000" w:csb0="000001FF" w:csb1="00000000"/>
-  </w:font>
-  <w:font w:name="Times New Roman">
-    <w:panose1 w:val="02020603050405020304"/>
-    <w:charset w:val="00"/>
-    <w:family w:val="roman"/>
-    <w:pitch w:val="variable"/>
-    <w:sig w:usb0="E0002EFF" w:usb1="C000785B" w:usb2="00000009" w:usb3="00000000" w:csb0="000001FF" w:csb1="00000000"/>
-  </w:font>
-  <w:font w:name="Calibri Light">
-    <w:panose1 w:val="020F0302020204030204"/>
-    <w:charset w:val="00"/>
-    <w:family w:val="swiss"/>
-    <w:pitch w:val="variable"/>
-    <w:sig w:usb0="E4002EFF" w:usb1="C000247B" w:usb2="00000009" w:usb3="00000000" w:csb0="000001FF" w:csb1="00000000"/>
-  </w:font>
-  <w:font w:name="Calibri">
-    <w:panose1 w:val="020F0502020204030204"/>
-    <w:charset w:val="00"/>
-    <w:family w:val="swiss"/>
-    <w:pitch w:val="variable"/>
-    <w:sig w:usb0="E4002EFF" w:usb1="C000247B" w:usb2="00000009" w:usb3="00000000" w:csb0="000001FF" w:csb1="00000000"/>
-  </w:font>
-</w:fonts>
-</file>
-
-<file path=word\footer1.xml><?xml version="1.0" encoding="utf-8"?>
+<file path=word/footer1.xml><?xml version="1.0" encoding="utf-8"?>
 <w:ftr xmlns:wpc="http://schemas.microsoft.com/office/word/2010/wordprocessingCanvas" xmlns:cx="http://schemas.microsoft.com/office/drawing/2014/chartex" xmlns:cx1="http://schemas.microsoft.com/office/drawing/2015/9/8/chartex" xmlns:cx2="http://schemas.microsoft.com/office/drawing/2015/10/21/chartex" xmlns:cx3="http://schemas.microsoft.com/office/drawing/2016/5/9/chartex" xmlns:cx4="http://schemas.microsoft.com/office/drawing/2016/5/10/chartex" xmlns:cx5="http://schemas.microsoft.com/office/drawing/2016/5/11/chartex" xmlns:cx6="http://schemas.microsoft.com/office/drawing/2016/5/12/chartex" xmlns:cx7="http://schemas.microsoft.com/office/drawing/2016/5/13/chartex" xmlns:cx8="http://schemas.microsoft.com/office/drawing/2016/5/14/chartex" xmlns:mc="http://schemas.openxmlformats.org/markup-compatibility/2006" xmlns:aink="http://schemas.microsoft.com/office/drawing/2016/ink" xmlns:am3d="http://schemas.microsoft.com/office/drawing/2017/model3d" xmlns:o="urn:schemas-microsoft-com:office:office" xmlns:r="http://schemas.openxmlformats.org/officeDocument/2006/relationships" xmlns:m="http://schemas.openxmlformats.org/officeDocument/2006/math" xmlns:v="urn:schemas-microsoft-com:vml" xmlns:wp14="http://schemas.microsoft.com/office/word/2010/wordprocessingDrawing" xmlns:wp="http://schemas.openxmlformats.org/drawingml/2006/wordprocessingDrawing" xmlns:w10="urn:schemas-microsoft-com:office:word" xmlns:w="http://schemas.openxmlformats.org/wordprocessingml/2006/main" xmlns:w14="http://schemas.microsoft.com/office/word/2010/wordml" xmlns:w15="http://schemas.microsoft.com/office/word/2012/wordml" xmlns:w16cid="http://schemas.microsoft.com/office/word/2016/wordml/cid" xmlns:w16se="http://schemas.microsoft.com/office/word/2015/wordml/symex" xmlns:wpg="http://schemas.microsoft.com/office/word/2010/wordprocessingGroup" xmlns:wpi="http://schemas.microsoft.com/office/word/2010/wordprocessingInk" xmlns:wne="http://schemas.microsoft.com/office/word/2006/wordml" xmlns:wps="http://schemas.microsoft.com/office/word/2010/wordprocessingShape" mc:Ignorable="w14 w15 w16se w16cid wp14">
   <w:p>
     <w:pPr>
@@ -4540,7 +4421,7 @@
 </w:ftr>
 </file>
 
-<file path=word\footnotes.xml><?xml version="1.0" encoding="utf-8"?>
+<file path=word/footnotes.xml><?xml version="1.0" encoding="utf-8"?>
 <w:footnotes xmlns:wpc="http://schemas.microsoft.com/office/word/2010/wordprocessingCanvas" xmlns:cx="http://schemas.microsoft.com/office/drawing/2014/chartex" xmlns:cx1="http://schemas.microsoft.com/office/drawing/2015/9/8/chartex" xmlns:cx2="http://schemas.microsoft.com/office/drawing/2015/10/21/chartex" xmlns:cx3="http://schemas.microsoft.com/office/drawing/2016/5/9/chartex" xmlns:cx4="http://schemas.microsoft.com/office/drawing/2016/5/10/chartex" xmlns:cx5="http://schemas.microsoft.com/office/drawing/2016/5/11/chartex" xmlns:cx6="http://schemas.microsoft.com/office/drawing/2016/5/12/chartex" xmlns:cx7="http://schemas.microsoft.com/office/drawing/2016/5/13/chartex" xmlns:cx8="http://schemas.microsoft.com/office/drawing/2016/5/14/chartex" xmlns:mc="http://schemas.openxmlformats.org/markup-compatibility/2006" xmlns:aink="http://schemas.microsoft.com/office/drawing/2016/ink" xmlns:am3d="http://schemas.microsoft.com/office/drawing/2017/model3d" xmlns:o="urn:schemas-microsoft-com:office:office" xmlns:r="http://schemas.openxmlformats.org/officeDocument/2006/relationships" xmlns:m="http://schemas.openxmlformats.org/officeDocument/2006/math" xmlns:v="urn:schemas-microsoft-com:vml" xmlns:wp14="http://schemas.microsoft.com/office/word/2010/wordprocessingDrawing" xmlns:wp="http://schemas.openxmlformats.org/drawingml/2006/wordprocessingDrawing" xmlns:w10="urn:schemas-microsoft-com:office:word" xmlns:w="http://schemas.openxmlformats.org/wordprocessingml/2006/main" xmlns:w14="http://schemas.microsoft.com/office/word/2010/wordml" xmlns:w15="http://schemas.microsoft.com/office/word/2012/wordml" xmlns:w16cid="http://schemas.microsoft.com/office/word/2016/wordml/cid" xmlns:w16se="http://schemas.microsoft.com/office/word/2015/wordml/symex" xmlns:wpg="http://schemas.microsoft.com/office/word/2010/wordprocessingGroup" xmlns:wpi="http://schemas.microsoft.com/office/word/2010/wordprocessingInk" xmlns:wne="http://schemas.microsoft.com/office/word/2006/wordml" xmlns:wps="http://schemas.microsoft.com/office/word/2010/wordprocessingShape" mc:Ignorable="w14 w15 w16se w16cid wp14">
   <w:footnote w:type="separator" w:id="-1">
     <w:p>
@@ -4559,7 +4440,7 @@
 </w:footnotes>
 </file>
 
-<file path=word\header1.xml><?xml version="1.0" encoding="utf-8"?>
+<file path=word/header1.xml><?xml version="1.0" encoding="utf-8"?>
 <w:hdr xmlns:wpc="http://schemas.microsoft.com/office/word/2010/wordprocessingCanvas" xmlns:cx="http://schemas.microsoft.com/office/drawing/2014/chartex" xmlns:cx1="http://schemas.microsoft.com/office/drawing/2015/9/8/chartex" xmlns:cx2="http://schemas.microsoft.com/office/drawing/2015/10/21/chartex" xmlns:cx3="http://schemas.microsoft.com/office/drawing/2016/5/9/chartex" xmlns:cx4="http://schemas.microsoft.com/office/drawing/2016/5/10/chartex" xmlns:cx5="http://schemas.microsoft.com/office/drawing/2016/5/11/chartex" xmlns:cx6="http://schemas.microsoft.com/office/drawing/2016/5/12/chartex" xmlns:cx7="http://schemas.microsoft.com/office/drawing/2016/5/13/chartex" xmlns:cx8="http://schemas.microsoft.com/office/drawing/2016/5/14/chartex" xmlns:mc="http://schemas.openxmlformats.org/markup-compatibility/2006" xmlns:aink="http://schemas.microsoft.com/office/drawing/2016/ink" xmlns:am3d="http://schemas.microsoft.com/office/drawing/2017/model3d" xmlns:o="urn:schemas-microsoft-com:office:office" xmlns:r="http://schemas.openxmlformats.org/officeDocument/2006/relationships" xmlns:m="http://schemas.openxmlformats.org/officeDocument/2006/math" xmlns:v="urn:schemas-microsoft-com:vml" xmlns:wp14="http://schemas.microsoft.com/office/word/2010/wordprocessingDrawing" xmlns:wp="http://schemas.openxmlformats.org/drawingml/2006/wordprocessingDrawing" xmlns:w10="urn:schemas-microsoft-com:office:word" xmlns:w="http://schemas.openxmlformats.org/wordprocessingml/2006/main" xmlns:w14="http://schemas.microsoft.com/office/word/2010/wordml" xmlns:w15="http://schemas.microsoft.com/office/word/2012/wordml" xmlns:w16cid="http://schemas.microsoft.com/office/word/2016/wordml/cid" xmlns:w16se="http://schemas.microsoft.com/office/word/2015/wordml/symex" xmlns:wpg="http://schemas.microsoft.com/office/word/2010/wordprocessingGroup" xmlns:wpi="http://schemas.microsoft.com/office/word/2010/wordprocessingInk" xmlns:wne="http://schemas.microsoft.com/office/word/2006/wordml" xmlns:wps="http://schemas.microsoft.com/office/word/2010/wordprocessingShape" mc:Ignorable="w14 w15 w16se w16cid wp14">
   <w:p>
     <w:pPr>
@@ -4580,7 +4461,7 @@
 </w:hdr>
 </file>
 
-<file path=word\numbering.xml><?xml version="1.0" encoding="utf-8"?>
+<file path=word/numbering.xml><?xml version="1.0" encoding="utf-8"?>
 <w:numbering xmlns:wpc="http://schemas.microsoft.com/office/word/2010/wordprocessingCanvas" xmlns:cx="http://schemas.microsoft.com/office/drawing/2014/chartex" xmlns:cx1="http://schemas.microsoft.com/office/drawing/2015/9/8/chartex" xmlns:cx2="http://schemas.microsoft.com/office/drawing/2015/10/21/chartex" xmlns:cx3="http://schemas.microsoft.com/office/drawing/2016/5/9/chartex" xmlns:cx4="http://schemas.microsoft.com/office/drawing/2016/5/10/chartex" xmlns:cx5="http://schemas.microsoft.com/office/drawing/2016/5/11/chartex" xmlns:cx6="http://schemas.microsoft.com/office/drawing/2016/5/12/chartex" xmlns:cx7="http://schemas.microsoft.com/office/drawing/2016/5/13/chartex" xmlns:cx8="http://schemas.microsoft.com/office/drawing/2016/5/14/chartex" xmlns:mc="http://schemas.openxmlformats.org/markup-compatibility/2006" xmlns:aink="http://schemas.microsoft.com/office/drawing/2016/ink" xmlns:am3d="http://schemas.microsoft.com/office/drawing/2017/model3d" xmlns:o="urn:schemas-microsoft-com:office:office" xmlns:r="http://schemas.openxmlformats.org/officeDocument/2006/relationships" xmlns:m="http://schemas.openxmlformats.org/officeDocument/2006/math" xmlns:v="urn:schemas-microsoft-com:vml" xmlns:wp14="http://schemas.microsoft.com/office/word/2010/wordprocessingDrawing" xmlns:wp="http://schemas.openxmlformats.org/drawingml/2006/wordprocessingDrawing" xmlns:w10="urn:schemas-microsoft-com:office:word" xmlns:w="http://schemas.openxmlformats.org/wordprocessingml/2006/main" xmlns:w14="http://schemas.microsoft.com/office/word/2010/wordml" xmlns:w15="http://schemas.microsoft.com/office/word/2012/wordml" xmlns:w16cid="http://schemas.microsoft.com/office/word/2016/wordml/cid" xmlns:w16se="http://schemas.microsoft.com/office/word/2015/wordml/symex" xmlns:wpg="http://schemas.microsoft.com/office/word/2010/wordprocessingGroup" xmlns:wpi="http://schemas.microsoft.com/office/word/2010/wordprocessingInk" xmlns:wne="http://schemas.microsoft.com/office/word/2006/wordml" xmlns:wps="http://schemas.microsoft.com/office/word/2010/wordprocessingShape" mc:Ignorable="w14 w15 w16se w16cid wp14">
   <w:abstractNum w:abstractNumId="0" w15:restartNumberingAfterBreak="0">
     <w:nsid w:val="2676237F"/>
@@ -4737,66 +4618,7 @@
 </w:numbering>
 </file>
 
-<file path=word\settings.xml><?xml version="1.0" encoding="utf-8"?>
-<w:settings xmlns:mc="http://schemas.openxmlformats.org/markup-compatibility/2006" xmlns:o="urn:schemas-microsoft-com:office:office" xmlns:r="http://schemas.openxmlformats.org/officeDocument/2006/relationships" xmlns:m="http://schemas.openxmlformats.org/officeDocument/2006/math" xmlns:v="urn:schemas-microsoft-com:vml" xmlns:w10="urn:schemas-microsoft-com:office:word" xmlns:w="http://schemas.openxmlformats.org/wordprocessingml/2006/main" xmlns:w14="http://schemas.microsoft.com/office/word/2010/wordml" xmlns:w15="http://schemas.microsoft.com/office/word/2012/wordml" xmlns:w16cid="http://schemas.microsoft.com/office/word/2016/wordml/cid" xmlns:w16se="http://schemas.microsoft.com/office/word/2015/wordml/symex" xmlns:sl="http://schemas.openxmlformats.org/schemaLibrary/2006/main" mc:Ignorable="w14 w15 w16se w16cid">
-  <w:zoom w:percent="100"/>
-  <w:displayBackgroundShape/>
-  <w:proofState w:spelling="clean" w:grammar="clean"/>
-  <w:defaultTabStop w:val="720"/>
-  <w:characterSpacingControl w:val="doNotCompress"/>
-  <w:footnotePr>
-    <w:footnote w:id="-1"/>
-    <w:footnote w:id="0"/>
-  </w:footnotePr>
-  <w:endnotePr>
-    <w:endnote w:id="-1"/>
-    <w:endnote w:id="0"/>
-  </w:endnotePr>
-  <w:compat>
-    <w:compatSetting w:name="compatibilityMode" w:uri="http://schemas.microsoft.com/office/word" w:val="15"/>
-    <w:compatSetting w:name="overrideTableStyleFontSizeAndJustification" w:uri="http://schemas.microsoft.com/office/word" w:val="1"/>
-    <w:compatSetting w:name="enableOpenTypeFeatures" w:uri="http://schemas.microsoft.com/office/word" w:val="1"/>
-    <w:compatSetting w:name="doNotFlipMirrorIndents" w:uri="http://schemas.microsoft.com/office/word" w:val="1"/>
-    <w:compatSetting w:name="differentiateMultirowTableHeaders" w:uri="http://schemas.microsoft.com/office/word" w:val="1"/>
-    <w:compatSetting w:name="useWord2013TrackBottomHyphenation" w:uri="http://schemas.microsoft.com/office/word" w:val="1"/>
-  </w:compat>
-  <w:rsids>
-    <w:rsidRoot w:val="00405717"/>
-    <w:rsid w:val="00405717"/>
-    <w:rsid w:val="00622B40"/>
-    <w:rsid w:val="0078008E"/>
-    <w:rsid w:val="00CC1B85"/>
-    <w:rsid w:val="00D6688D"/>
-  </w:rsids>
-  <m:mathPr>
-    <m:mathFont m:val="Cambria Math"/>
-    <m:brkBin m:val="before"/>
-    <m:brkBinSub m:val="--"/>
-    <m:smallFrac m:val="0"/>
-    <m:dispDef/>
-    <m:lMargin m:val="0"/>
-    <m:rMargin m:val="0"/>
-    <m:defJc m:val="centerGroup"/>
-    <m:wrapIndent m:val="1440"/>
-    <m:intLim m:val="subSup"/>
-    <m:naryLim m:val="undOvr"/>
-  </m:mathPr>
-  <w:themeFontLang w:val="en-US"/>
-  <w:clrSchemeMapping w:bg1="light1" w:t1="dark1" w:bg2="light2" w:t2="dark2" w:accent1="accent1" w:accent2="accent2" w:accent3="accent3" w:accent4="accent4" w:accent5="accent5" w:accent6="accent6" w:hyperlink="hyperlink" w:followedHyperlink="followedHyperlink"/>
-  <w:shapeDefaults>
-    <o:shapedefaults v:ext="edit" spidmax="1026"/>
-    <o:shapelayout v:ext="edit">
-      <o:idmap v:ext="edit" data="1"/>
-    </o:shapelayout>
-  </w:shapeDefaults>
-  <w:decimalSymbol w:val="."/>
-  <w:listSeparator w:val=","/>
-  <w14:docId w14:val="30E0D79B"/>
-  <w15:docId w15:val="{31C5824E-12DF-4F92-92E8-4C109B2C3DDF}"/>
-</w:settings>
-</file>
-
-<file path=word\styles.xml><?xml version="1.0" encoding="utf-8"?>
+<file path=word/styles.xml><?xml version="1.0" encoding="utf-8"?>
 <w:styles xmlns:mc="http://schemas.openxmlformats.org/markup-compatibility/2006" xmlns:r="http://schemas.openxmlformats.org/officeDocument/2006/relationships" xmlns:w="http://schemas.openxmlformats.org/wordprocessingml/2006/main" xmlns:w14="http://schemas.microsoft.com/office/word/2010/wordml" xmlns:w15="http://schemas.microsoft.com/office/word/2012/wordml" xmlns:w16cid="http://schemas.microsoft.com/office/word/2016/wordml/cid" xmlns:w16se="http://schemas.microsoft.com/office/word/2015/wordml/symex" mc:Ignorable="w14 w15 w16se w16cid">
   <w:docDefaults>
     <w:rPrDefault>
@@ -5442,7 +5264,7 @@
 </w:styles>
 </file>
 
-<file path=word\theme\theme1.xml><?xml version="1.0" encoding="utf-8"?>
+<file path=word/theme/theme1.xml><?xml version="1.0" encoding="utf-8"?>
 <a:theme xmlns:a="http://schemas.openxmlformats.org/drawingml/2006/main" name="Office Theme">
   <a:themeElements>
     <a:clrScheme name="Office">
@@ -5735,8 +5557,4 @@
     </a:ext>
   </a:extLst>
 </a:theme>
-</file>
-
-<file path=word\webSettings.xml><?xml version="1.0" encoding="utf-8"?>
-<w:webSettings xmlns:mc="http://schemas.openxmlformats.org/markup-compatibility/2006" xmlns:r="http://schemas.openxmlformats.org/officeDocument/2006/relationships" xmlns:w="http://schemas.openxmlformats.org/wordprocessingml/2006/main" xmlns:w14="http://schemas.microsoft.com/office/word/2010/wordml" xmlns:w15="http://schemas.microsoft.com/office/word/2012/wordml" xmlns:w16cid="http://schemas.microsoft.com/office/word/2016/wordml/cid" xmlns:w16se="http://schemas.microsoft.com/office/word/2015/wordml/symex" mc:Ignorable="w14 w15 w16se w16cid"/>
 </file>
</xml_diff>